<commit_message>
Verify on real Kaggle data; fix ES NaN-company bug; update paper and slides with real results
- index_to_elasticsearch: postings with no company were sent as NaN (invalid
  JSON) and rejected; all 1500/1500 real postings now index
- Paper/slides: real-data accuracy (83.3%), XGBoost comparison, real feature
  weights and top skills; 30 tests
- Correct STRETCH_GOALS note that misattributed the 15 missing postings
- Verified end to end: Airflow DAG (real data, AUC 0.947), Kafka, Elasticsearch
</commit_message>
<xml_diff>
--- a/rsp/SkillBridge_Research_Paper.docx
+++ b/rsp/SkillBridge_Research_Paper.docx
@@ -1178,7 +1178,7 @@
           <w:b w:val="0"/>
           <w:i w:val="0"/>
         </w:rPr>
-        <w:t>Correctness is checked by an automated suite of 27 tests. They cover the extractor (canonical casing, overlap resolution, empty input, ambiguous short names), the feature store (empty postings, students with no skills, demand percentages), upload validation, the training guard, Kafka message handling, S3 uploads, and smoke tests that render every dashboard page against real pipeline outputs.</w:t>
+        <w:t>Correctness is checked by an automated suite of 30 tests. They cover the extractor (canonical casing, overlap resolution, empty input, ambiguous short names), the feature store (empty postings, students with no skills, demand percentages), upload validation, the training guard, Kafka message handling, S3 uploads, and smoke tests that render every dashboard page against real pipeline outputs.</w:t>
       </w:r>
     </w:p>
     <w:p>
@@ -1425,7 +1425,7 @@
           <w:b w:val="0"/>
           <w:i w:val="0"/>
         </w:rPr>
-        <w:t>On the real postings, 1,485 of the 1,500 sampled postings were indexed into Elasticsearch without error; the other 15 were rejected at indexing time. The case-sensitive rule for Go, C and R was introduced after manual review of extractions on this real text, which is where the "go above and beyond" false positive first appeared.</w:t>
+        <w:t>On the real postings, an early run indexed only 1,485 of the 1,500 sampled postings: 15 had no company name, and the missing value was serialised as NaN, which is not valid JSON. Substituting a placeholder fixed this, and all 1,500 postings are now indexed. The case-sensitive rule for Go, C and R was introduced after manual review of extractions on this real text, which is where the "go above and beyond" false positive first appeared.</w:t>
       </w:r>
     </w:p>
     <w:p>
@@ -1445,7 +1445,7 @@
           <w:b w:val="0"/>
           <w:i w:val="0"/>
         </w:rPr>
-        <w:t>Fig. 2 shows the fifteen most requested skills in the synthetic configuration. Because the generator adds one soft skill to every posting, soft skills lead this ranking. The figure is included mainly to show the form of the output. On real data the ranking reflects the sampled LinkedIn postings and changes whenever new postings are ingested, which is the point of deriving it from data instead of fixing it by hand.</w:t>
+        <w:t>Fig. 2 shows the fifteen most requested skills in the synthetic configuration. Because the generator adds one soft skill to every posting, soft skills lead this ranking. The figure is included mainly to show the form of the output. On real data the ranking reflects the sampled LinkedIn postings and changes whenever new postings are ingested, which is the point of deriving it from data instead of fixing it by hand. In the real sample, Communication appeared in 48.6% of postings and Leadership in 22.5%, followed by Time Management, Problem Solving and Agile; the most requested technical skills were SQL (4.1%) and Python (3.2%).</w:t>
       </w:r>
     </w:p>
     <w:p>
@@ -1648,7 +1648,7 @@
               <w:rPr>
                 <w:sz w:val="19"/>
               </w:rPr>
-              <w:t>Selected model</w:t>
+              <w:t>Logistic regression (selected)</w:t>
             </w:r>
           </w:p>
         </w:tc>
@@ -1676,7 +1676,65 @@
               <w:rPr>
                 <w:sz w:val="19"/>
               </w:rPr>
-              <w:t>—</w:t>
+              <w:t>83.3%</w:t>
+            </w:r>
+          </w:p>
+        </w:tc>
+      </w:tr>
+      <w:tr>
+        <w:tc>
+          <w:tcPr>
+            <w:tcW w:type="dxa" w:w="2835"/>
+          </w:tcPr>
+          <w:p>
+            <w:r/>
+            <w:r>
+              <w:rPr>
+                <w:sz w:val="19"/>
+              </w:rPr>
+              <w:t>Real (campus + LinkedIn)</w:t>
+            </w:r>
+          </w:p>
+        </w:tc>
+        <w:tc>
+          <w:tcPr>
+            <w:tcW w:type="dxa" w:w="3061"/>
+          </w:tcPr>
+          <w:p>
+            <w:r/>
+            <w:r>
+              <w:rPr>
+                <w:sz w:val="19"/>
+              </w:rPr>
+              <w:t>XGBoost</w:t>
+            </w:r>
+          </w:p>
+        </w:tc>
+        <w:tc>
+          <w:tcPr>
+            <w:tcW w:type="dxa" w:w="1361"/>
+          </w:tcPr>
+          <w:p>
+            <w:r/>
+            <w:r>
+              <w:rPr>
+                <w:sz w:val="19"/>
+              </w:rPr>
+              <w:t>0.896</w:t>
+            </w:r>
+          </w:p>
+        </w:tc>
+        <w:tc>
+          <w:tcPr>
+            <w:tcW w:type="dxa" w:w="1361"/>
+          </w:tcPr>
+          <w:p>
+            <w:r/>
+            <w:r>
+              <w:rPr>
+                <w:sz w:val="19"/>
+              </w:rPr>
+              <w:t>77.8%</w:t>
             </w:r>
           </w:p>
         </w:tc>
@@ -1812,7 +1870,7 @@
           <w:b w:val="0"/>
           <w:i w:val="0"/>
         </w:rPr>
-        <w:t>On the real configuration the selected model reached an AUC of 0.947. The CGPA proxy was the dominant feature, which is expected for this dataset, where placement outcomes are driven mainly by academic record and work experience. The high AUC should therefore be read as a property of this dataset rather than as proof that the skill features are strongly predictive. Because the skills were imputed from specialisation, they carry little information that the model cannot already get from other fields.</w:t>
+        <w:t>On the real configuration logistic regression was selected with an AUC of 0.947 and an accuracy of 83.3%, ahead of XGBoost (AUC 0.896). The CGPA proxy was by far the largest standardised coefficient (2.24), followed by internships (0.69); the alignment score contributed little (0.08), and projects and certifications carried no weight because the source data does not record them. This is expected for this dataset, where placement outcomes are driven mainly by academic record and work experience. The high AUC should therefore be read as a property of this dataset rather than as proof that the skill features are strongly predictive. Because the skills were imputed from specialisation, they carry little information that the model cannot already get from other fields.</w:t>
       </w:r>
     </w:p>
     <w:p>

</xml_diff>